<commit_message>
Declaration: Small Model Track boxes ticked, PDF re-exported
Co-Authored-By: Claude Opus 5 <noreply@anthropic.com>
</commit_message>
<xml_diff>
--- a/package/declarations/CUHK-X_Honor_Declaration.docx
+++ b/package/declarations/CUHK-X_Honor_Declaration.docx
@@ -149,7 +149,7 @@
                 <w:color w:val="000000"/>
                 <w:highlight w:val="yellow"/>
               </w:rPr>
-              <w:t xml:space="preserve">☐ Small Model Track </w:t>
+              <w:t xml:space="preserve">☑ Small Model Track </w:t>
             </w:r>
             <w:r>
               <w:rPr>
@@ -555,7 +555,7 @@
           <w:sz w:val="17"/>
           <w:highlight w:val="yellow"/>
         </w:rPr>
-        <w:t xml:space="preserve">☐ Small Model Track: The frozen solution satisfies the published model-size and model/API/LLM restrictions.</w:t>
+        <w:t xml:space="preserve">☑ Small Model Track: The frozen solution satisfies the published model-size and model/API/LLM restrictions.</w:t>
       </w:r>
     </w:p>
     <w:p>

</xml_diff>